<commit_message>
Write Notepad results as Unicode files instead of keyboard input
</commit_message>
<xml_diff>
--- a/Lab4-report/Instructions.docx
+++ b/Lab4-report/Instructions.docx
@@ -35,7 +35,7 @@
     </w:p>
     <w:p>
       <w:r>
-        <w:t>3. script1.vbs и script2.vbs самостоятельные: common.vbs и PowerShell им НЕ нужны. Для script3.js рядом требуются calculator.ps1 и text1.txt.</w:t>
+        <w:t>3. Обновлённые script1.vbs и script2.vbs не требуют common.vbs, но теперь используют calculator.ps1 и Windows PowerShell для чтения результата. Для script3.js также нужны calculator.ps1 и text1.txt. Копируйте весь комплект.</w:t>
       </w:r>
     </w:p>
     <w:p>
@@ -50,12 +50,12 @@
     </w:p>
     <w:p>
       <w:r>
-        <w:t>6. Сохраните результат Блокнота вручную (Ctrl+S), например task1-result.txt. Закройте Калькулятор и Блокнот.</w:t>
+        <w:t>6. Результат уже сохранён автоматически в results\script1-result.txt. Закройте Калькулятор и Блокнот.</w:t>
       </w:r>
     </w:p>
     <w:p>
       <w:r>
-        <w:t>7. Запустите script2.vbs. Ожидаются «Шестнадцатеричный результат: 176» и «Десятичный результат: 374». Калькулятор вернётся в обычный режим. Сохраните результат вручную.</w:t>
+        <w:t>7. Запустите script2.vbs. Ожидаются «Шестнадцатеричный результат: 176» и «Десятичный результат: 374». Калькулятор вернётся в обычный режим. Результат сохранён автоматически в results\script2-result.txt.</w:t>
       </w:r>
     </w:p>
     <w:p>
@@ -83,7 +83,7 @@
     </w:p>
     <w:p>
       <w:r>
-        <w:t>Первые два задания повторяют подход отчёта: Run, AppActivate по русскому/английскому заголовку, SendKeys, Ctrl+C/Ctrl+V. Добавлены очистка Калькулятора, ожидание активации и проверка её успеха. Работают с классическим и современным интерфейсом при поддержке указанных сочетаний клавиш. Результат первого задания вставляется из Калькулятора, а не записывается константой.</w:t>
+        <w:t>В первых двух заданиях арифметика выполняется Калькулятором. После обнаруженной ошибки передачи кириллицы через SendKeys подписи записываются в UTF-16LE-файлы, затем открываются в Блокноте. Числа читаются из буфера обмена через PowerShell, а не подставляются константами. Это отличается от кода исходного отчёта, но сохраняет результат задания и устраняет зависимость русского текста от раскладки. common.vbs не нужен: общие функции включены в каждый .vbs. calculator.ps1 теперь нужен всем трём заданиям.</w:t>
       </w:r>
     </w:p>
     <w:p>
@@ -111,12 +111,12 @@
     </w:p>
     <w:p>
       <w:r>
-        <w:t>SendKeys зависит от активного окна. Не открывайте несколько Блокнотов/Калькуляторов, не переключайте фокус, не запускайте сценарии параллельно. Если кириллическая подпись вводится неверно, сообщите фактический результат и текущую раскладку. Не отключайте защиту Windows при блокировке сценариев.</w:t>
+        <w:t>SendKeys зависит от активного окна. Не открывайте несколько Блокнотов/Калькуляторов, не переключайте фокус, не запускайте сценарии параллельно. Русские подписи не отправляются через SendKeys; если результат не считан, сценарий должен показать ошибку вместо подстановки готового числа. Не отключайте защиту Windows при блокировке сценариев.</w:t>
       </w:r>
     </w:p>
     <w:p>
       <w:r>
-        <w:t>VBScript должен быть установлен как компонент Windows. Для третьего задания требуется Windows PowerShell 5.1; дочерний процесс запускается с ExecutionPolicy Bypass, без постоянного изменения политики. Корпоративные запреты этим не обходятся.</w:t>
+        <w:t>VBScript должен быть установлен как компонент Windows. Для всех трёх заданий требуется Windows PowerShell 5.1; дочерний процесс запускается с ExecutionPolicy Bypass, без постоянного изменения политики. Корпоративные запреты этим не обходятся.</w:t>
       </w:r>
     </w:p>
     <w:p>

</xml_diff>